<commit_message>
final update for the day
</commit_message>
<xml_diff>
--- a/resume_jsigley.docx
+++ b/resume_jsigley.docx
@@ -144,132 +144,18 @@
     </w:p>
     <w:p>
       <w:pPr>
-        <w:spacing w:after="0"/>
-        <w:rPr>
-          <w:sz w:val="16"/>
-          <w:szCs w:val="16"/>
-        </w:rPr>
-      </w:pPr>
-      <w:r>
-        <w:rPr>
-          <w:sz w:val="16"/>
-          <w:szCs w:val="16"/>
-        </w:rPr>
-        <w:t>Cybersecurity and IT support candidate with two years of university study in Cyber Security at La Trobe University</w:t>
-      </w:r>
-      <w:r>
-        <w:rPr>
-          <w:sz w:val="16"/>
-          <w:szCs w:val="16"/>
-        </w:rPr>
-        <w:t>.</w:t>
-      </w:r>
-      <w:r>
-        <w:rPr>
-          <w:sz w:val="16"/>
-          <w:szCs w:val="16"/>
-        </w:rPr>
-        <w:t xml:space="preserve"> Specializing </w:t>
-      </w:r>
-      <w:r>
-        <w:rPr>
-          <w:sz w:val="16"/>
-          <w:szCs w:val="16"/>
-        </w:rPr>
-        <w:t>in security operations with hands on experience building and operating SIEM homelabs using splu</w:t>
-      </w:r>
-      <w:r>
-        <w:rPr>
-          <w:sz w:val="16"/>
-          <w:szCs w:val="16"/>
-        </w:rPr>
-        <w:t>n</w:t>
-      </w:r>
-      <w:r>
-        <w:rPr>
-          <w:sz w:val="16"/>
-          <w:szCs w:val="16"/>
-        </w:rPr>
-        <w:t>k and wazuh. Skilled in log analysis, threat detection</w:t>
-      </w:r>
-      <w:r>
-        <w:rPr>
-          <w:sz w:val="16"/>
-          <w:szCs w:val="16"/>
-        </w:rPr>
-        <w:t xml:space="preserve">, and incident triage aligned with MITRE ATT&amp;CK </w:t>
-      </w:r>
-      <w:r>
-        <w:rPr>
-          <w:sz w:val="16"/>
-          <w:szCs w:val="16"/>
-        </w:rPr>
-        <w:t>techniques. Experienced</w:t>
-      </w:r>
-      <w:r>
-        <w:rPr>
-          <w:sz w:val="16"/>
-          <w:szCs w:val="16"/>
-        </w:rPr>
-        <w:t xml:space="preserve"> </w:t>
-      </w:r>
-      <w:r>
-        <w:rPr>
-          <w:sz w:val="16"/>
-          <w:szCs w:val="16"/>
-        </w:rPr>
-        <w:t>analysing</w:t>
-      </w:r>
-      <w:r>
-        <w:rPr>
-          <w:sz w:val="16"/>
-          <w:szCs w:val="16"/>
-        </w:rPr>
-        <w:t xml:space="preserve"> </w:t>
-      </w:r>
-      <w:r>
-        <w:rPr>
-          <w:sz w:val="16"/>
-          <w:szCs w:val="16"/>
-        </w:rPr>
-        <w:t>windows</w:t>
-      </w:r>
-      <w:r>
-        <w:rPr>
-          <w:sz w:val="16"/>
-          <w:szCs w:val="16"/>
-        </w:rPr>
-        <w:t xml:space="preserve"> security events, investigating alerts, and documenting incident response procedures. Seeking an entry-level SOC analyst role where practical monitoring, </w:t>
-      </w:r>
-      <w:r>
-        <w:rPr>
-          <w:sz w:val="16"/>
-          <w:szCs w:val="16"/>
-        </w:rPr>
-        <w:t>investigation</w:t>
-      </w:r>
-      <w:r>
-        <w:rPr>
-          <w:sz w:val="16"/>
-          <w:szCs w:val="16"/>
-        </w:rPr>
-        <w:t>, and threat detection skills can support organizational security op</w:t>
-      </w:r>
-      <w:r>
-        <w:rPr>
-          <w:sz w:val="16"/>
-          <w:szCs w:val="16"/>
-        </w:rPr>
-        <w:t>erations.</w:t>
-      </w:r>
-    </w:p>
-    <w:p>
-      <w:pPr>
-        <w:rPr>
-          <w:sz w:val="16"/>
-          <w:szCs w:val="16"/>
-        </w:rPr>
-      </w:pPr>
+        <w:rPr>
+          <w:sz w:val="16"/>
+          <w:szCs w:val="16"/>
+        </w:rPr>
+      </w:pPr>
+      <w:r>
+        <w:rPr>
+          <w:sz w:val="16"/>
+          <w:szCs w:val="16"/>
+        </w:rPr>
+        <w:t>Cybersecurity and IT support candidate with two years of university study in Cyber Security at La Trobe University and ISC2 Certified in Cybersecurity (CC). Built a multi-PC home lab from five repaired computers, including Linux server administration, virtualisation and a Splunk monitoring setup. Background in trades, field inspection and customer service, with strong documentation and escalation habits. Seeking an entry-level IT support, network or SOC analyst role.</w:t>
+      </w:r>
     </w:p>
     <w:p>
       <w:pPr>
@@ -291,79 +177,33 @@
       <w:pPr>
         <w:spacing w:line="240" w:lineRule="auto"/>
         <w:rPr>
-          <w:sz w:val="16"/>
-          <w:szCs w:val="16"/>
-        </w:rPr>
-      </w:pPr>
-      <w:r>
-        <w:rPr>
-          <w:sz w:val="16"/>
-          <w:szCs w:val="16"/>
-        </w:rPr>
-        <w:t>Splunk | Wazuh | windows event logs | Wireshark</w:t>
-      </w:r>
-    </w:p>
-    <w:p>
-      <w:pPr>
-        <w:spacing w:line="240" w:lineRule="auto"/>
-        <w:rPr>
-          <w:sz w:val="16"/>
-          <w:szCs w:val="16"/>
-        </w:rPr>
-      </w:pPr>
-      <w:r>
-        <w:rPr>
-          <w:sz w:val="16"/>
-          <w:szCs w:val="16"/>
-        </w:rPr>
-        <w:t xml:space="preserve">Active directory | </w:t>
-      </w:r>
-      <w:r>
-        <w:rPr>
-          <w:sz w:val="16"/>
-          <w:szCs w:val="16"/>
-        </w:rPr>
-        <w:t>PowerShell | Bash | Nmap | Burp Suite | Meta</w:t>
-      </w:r>
-      <w:r>
-        <w:rPr>
-          <w:sz w:val="16"/>
-          <w:szCs w:val="16"/>
-        </w:rPr>
-        <w:t>s</w:t>
-      </w:r>
-      <w:r>
-        <w:rPr>
-          <w:sz w:val="16"/>
-          <w:szCs w:val="16"/>
-        </w:rPr>
-        <w:t>ploit</w:t>
-      </w:r>
-    </w:p>
-    <w:p>
-      <w:pPr>
-        <w:spacing w:line="240" w:lineRule="auto"/>
-        <w:rPr>
-          <w:sz w:val="16"/>
-          <w:szCs w:val="16"/>
-        </w:rPr>
-      </w:pPr>
-      <w:r>
-        <w:rPr>
-          <w:sz w:val="16"/>
-          <w:szCs w:val="16"/>
-        </w:rPr>
-        <w:t>MITRE ATT&amp;CK | SIEM Monitoring | Log Analysis | Incident Triage</w:t>
-      </w:r>
-    </w:p>
-    <w:p>
-      <w:pPr>
-        <w:spacing w:line="240" w:lineRule="auto"/>
-        <w:rPr>
-          <w:sz w:val="20"/>
-          <w:szCs w:val="20"/>
-        </w:rPr>
-      </w:pPr>
+          <w:sz w:val="20"/>
+          <w:szCs w:val="20"/>
+        </w:rPr>
+      </w:pPr>
+      <w:r>
+        <w:rPr>
+          <w:sz w:val="16"/>
+          <w:szCs w:val="16"/>
+        </w:rPr>
+        <w:t>Splunk | Wireshark | Nmap | Kali Linux</w:t>
+      </w:r>
+      <w:r>
+        <w:rPr>
+          <w:sz w:val="16"/>
+          <w:szCs w:val="16"/>
+        </w:rPr>
+        <w:br/>
+        <w:t>Active Directory | PowerShell | Bash | Burp Suite | Metasploit</w:t>
+      </w:r>
+      <w:r>
+        <w:rPr>
+          <w:sz w:val="16"/>
+          <w:szCs w:val="16"/>
+        </w:rPr>
+        <w:br/>
+        <w:t>MITRE ATT&amp;CK | Log Analysis (basic) | Incident Response Playbooks</w:t>
+      </w:r>
     </w:p>
     <w:p>
       <w:pPr>
@@ -449,14 +289,7 @@
           <w:sz w:val="16"/>
           <w:szCs w:val="16"/>
         </w:rPr>
-        <w:t>Splunk, wazuh, security log collection, detection engineering fundamentals, investigation</w:t>
-      </w:r>
-      <w:r>
-        <w:rPr>
-          <w:sz w:val="16"/>
-          <w:szCs w:val="16"/>
-        </w:rPr>
-        <w:t xml:space="preserve"> workflows.</w:t>
+        <w:t>Splunk (home lab), Wazuh (TryHackMe labs), security log collection, investigation workflows</w:t>
       </w:r>
     </w:p>
     <w:p>
@@ -731,7 +564,6 @@
           <w:sz w:val="20"/>
           <w:szCs w:val="20"/>
         </w:rPr>
-        <w:lastRenderedPageBreak/>
         <w:t>Technical Projects(GitHub Portfolio)</w:t>
       </w:r>
     </w:p>
@@ -787,6 +619,7 @@
           <w:sz w:val="20"/>
           <w:szCs w:val="20"/>
         </w:rPr>
+        <w:lastRenderedPageBreak/>
         <w:t>Diagnosed and repaired five non-working computers using SystemRescue (hardware diagnostics, SSD and RAM upgrades)</w:t>
       </w:r>
     </w:p>
@@ -1148,122 +981,6 @@
       <w:pPr>
         <w:spacing w:line="240" w:lineRule="auto"/>
         <w:rPr>
-          <w:sz w:val="16"/>
-          <w:szCs w:val="16"/>
-        </w:rPr>
-      </w:pPr>
-      <w:r>
-        <w:rPr>
-          <w:sz w:val="16"/>
-          <w:szCs w:val="16"/>
-        </w:rPr>
-        <w:t>Example Security Investigation</w:t>
-      </w:r>
-    </w:p>
-    <w:p>
-      <w:pPr>
-        <w:spacing w:line="240" w:lineRule="auto"/>
-        <w:rPr>
-          <w:sz w:val="16"/>
-          <w:szCs w:val="16"/>
-        </w:rPr>
-      </w:pPr>
-      <w:r>
-        <w:rPr>
-          <w:sz w:val="16"/>
-          <w:szCs w:val="16"/>
-        </w:rPr>
-        <w:t>Simulated brute force attack investigation</w:t>
-      </w:r>
-    </w:p>
-    <w:p>
-      <w:pPr>
-        <w:pStyle w:val="ListParagraph"/>
-        <w:numPr>
-          <w:ilvl w:val="0"/>
-          <w:numId w:val="6"/>
-        </w:numPr>
-        <w:spacing w:line="240" w:lineRule="auto"/>
-        <w:rPr>
-          <w:sz w:val="16"/>
-          <w:szCs w:val="16"/>
-        </w:rPr>
-      </w:pPr>
-      <w:r>
-        <w:rPr>
-          <w:sz w:val="16"/>
-          <w:szCs w:val="16"/>
-        </w:rPr>
-        <w:t>Analysed Windows Event logs (event ID 4625 login failures)</w:t>
-      </w:r>
-    </w:p>
-    <w:p>
-      <w:pPr>
-        <w:pStyle w:val="ListParagraph"/>
-        <w:numPr>
-          <w:ilvl w:val="0"/>
-          <w:numId w:val="6"/>
-        </w:numPr>
-        <w:spacing w:line="240" w:lineRule="auto"/>
-        <w:rPr>
-          <w:sz w:val="16"/>
-          <w:szCs w:val="16"/>
-        </w:rPr>
-      </w:pPr>
-      <w:r>
-        <w:rPr>
-          <w:sz w:val="16"/>
-          <w:szCs w:val="16"/>
-        </w:rPr>
-        <w:t>Correlated events within Splunk SIEM</w:t>
-      </w:r>
-    </w:p>
-    <w:p>
-      <w:pPr>
-        <w:pStyle w:val="ListParagraph"/>
-        <w:numPr>
-          <w:ilvl w:val="0"/>
-          <w:numId w:val="6"/>
-        </w:numPr>
-        <w:spacing w:line="240" w:lineRule="auto"/>
-        <w:rPr>
-          <w:sz w:val="16"/>
-          <w:szCs w:val="16"/>
-        </w:rPr>
-      </w:pPr>
-      <w:r>
-        <w:rPr>
-          <w:sz w:val="16"/>
-          <w:szCs w:val="16"/>
-        </w:rPr>
-        <w:t>Identified source IP and attack pattern</w:t>
-      </w:r>
-    </w:p>
-    <w:p>
-      <w:pPr>
-        <w:pStyle w:val="ListParagraph"/>
-        <w:numPr>
-          <w:ilvl w:val="0"/>
-          <w:numId w:val="6"/>
-        </w:numPr>
-        <w:spacing w:line="240" w:lineRule="auto"/>
-        <w:rPr>
-          <w:sz w:val="16"/>
-          <w:szCs w:val="16"/>
-        </w:rPr>
-      </w:pPr>
-      <w:r>
-        <w:rPr>
-          <w:sz w:val="16"/>
-          <w:szCs w:val="16"/>
-        </w:rPr>
-        <w:t>Documented findings and recommended mitigation</w:t>
-      </w:r>
-    </w:p>
-    <w:p>
-      <w:pPr>
-        <w:spacing w:line="240" w:lineRule="auto"/>
-        <w:rPr>
           <w:sz w:val="20"/>
           <w:szCs w:val="20"/>
         </w:rPr>
@@ -1511,7 +1228,6 @@
           <w:sz w:val="20"/>
           <w:szCs w:val="20"/>
         </w:rPr>
-        <w:lastRenderedPageBreak/>
         <w:t>Commonwealth Bank – Cybersecurity</w:t>
       </w:r>
     </w:p>
@@ -1617,6 +1333,7 @@
           <w:sz w:val="20"/>
           <w:szCs w:val="20"/>
         </w:rPr>
+        <w:lastRenderedPageBreak/>
         <w:t>Education</w:t>
       </w:r>
     </w:p>
@@ -2176,7 +1893,6 @@
           <w:sz w:val="20"/>
           <w:szCs w:val="20"/>
         </w:rPr>
-        <w:lastRenderedPageBreak/>
         <w:t>Handled client data with confidentiality</w:t>
       </w:r>
     </w:p>

</xml_diff>